<commit_message>
2026-04-23: clarify local-only end-user setup
</commit_message>
<xml_diff>
--- a/second_brain_setup/2nd_Brain_Setup_Guide.docx
+++ b/second_brain_setup/2nd_Brain_Setup_Guide.docx
@@ -88,6 +88,21 @@
       </w:r>
       <w:r>
         <w:t>The Codex app — the main interface for managing your 2nd Brain</w:t>
+      </w:r>
+    </w:p>
+    <w:p>
+      <w:pPr>
+        <w:pStyle w:val="ListBullet"/>
+        <w:spacing w:after="60"/>
+      </w:pPr>
+      <w:r>
+        <w:rPr>
+          <w:b/>
+        </w:rPr>
+        <w:t xml:space="preserve">Starter folder — </w:t>
+      </w:r>
+      <w:r>
+        <w:t>The starter folder from GitHub — downloaded one time with no GitHub account required</w:t>
       </w:r>
     </w:p>
     <w:p>
@@ -210,6 +225,15 @@
         <w:spacing w:after="60"/>
       </w:pPr>
       <w:r>
+        <w:t>No GitHub account is needed for the end user</w:t>
+      </w:r>
+    </w:p>
+    <w:p>
+      <w:pPr>
+        <w:pStyle w:val="ListBullet"/>
+        <w:spacing w:after="60"/>
+      </w:pPr>
+      <w:r>
         <w:t>About 30–45 minutes of uninterrupted time</w:t>
       </w:r>
     </w:p>
@@ -638,7 +662,7 @@
           <w:color w:val="FFFFFF"/>
           <w:sz w:val="26"/>
         </w:rPr>
-        <w:t xml:space="preserve">  STEP 5:  Install Codex CLI (Optional Backup)  </w:t>
+        <w:t xml:space="preserve">  STEP 5:  Install Codex CLI (Optional Terminal Interface)  </w:t>
       </w:r>
     </w:p>
     <w:p>
@@ -909,7 +933,7 @@
         <w:spacing w:after="120"/>
       </w:pPr>
       <w:r>
-        <w:t>The Codex app is the recommended way to manage this 2nd Brain system. It lets you keep threads, review changes, use worktrees, and sync with GitHub from one desktop app.</w:t>
+        <w:t>The Codex app is the recommended way to manage this 2nd Brain system. It lets you keep threads, review changes, and work with the local files on your Mac from one desktop app.</w:t>
       </w:r>
     </w:p>
     <w:p>
@@ -994,6 +1018,25 @@
     </w:p>
     <w:p>
       <w:pPr>
+        <w:spacing w:after="120"/>
+      </w:pPr>
+      <w:r>
+        <w:rPr>
+          <w:b/>
+          <w:color w:val="C05000"/>
+        </w:rPr>
+        <w:t xml:space="preserve">NOTE: </w:t>
+      </w:r>
+      <w:r>
+        <w:rPr>
+          <w:i/>
+          <w:color w:val="C05000"/>
+        </w:rPr>
+        <w:t>GitHub is used only to download the starter folder structure and AGENTS.md. Your personal 2nd Brain data stays local on your Mac and is not backed up to GitHub.</w:t>
+      </w:r>
+    </w:p>
+    <w:p>
+      <w:pPr>
         <w:spacing w:before="160" w:after="80"/>
       </w:pPr>
       <w:r>
@@ -1010,7 +1053,7 @@
         <w:spacing w:after="120"/>
       </w:pPr>
       <w:r>
-        <w:t>In Terminal, type:</w:t>
+        <w:t>In Terminal, type the HTTPS clone command below. This does not require a GitHub account if the starter repository is public:</w:t>
       </w:r>
     </w:p>
     <w:p>
@@ -1040,7 +1083,7 @@
           <w:color w:val="D40000"/>
           <w:sz w:val="20"/>
         </w:rPr>
-        <w:t>git clone git@github.com:CJROYCE4311/codexbrain.git 2nd_Brain_Codex</w:t>
+        <w:t>git clone https://github.com/CJROYCE4311/codexbrain.git 2nd_Brain_Codex</w:t>
       </w:r>
     </w:p>
     <w:p>
@@ -1311,7 +1354,7 @@
         <w:spacing w:after="120"/>
       </w:pPr>
       <w:r>
-        <w:t>When you are done, tell Codex to save your changes:</w:t>
+        <w:t>When you are done, ask Codex to summarize what changed:</w:t>
       </w:r>
     </w:p>
     <w:p>
@@ -1320,7 +1363,7 @@
         <w:spacing w:after="60"/>
       </w:pPr>
       <w:r>
-        <w:t>Type:  sync changes</w:t>
+        <w:t>Type:  summarize today's changes</w:t>
       </w:r>
     </w:p>
     <w:p>
@@ -1329,7 +1372,7 @@
         <w:spacing w:after="60"/>
       </w:pPr>
       <w:r>
-        <w:t>Codex will stage, commit, and upload your changes to GitHub</w:t>
+        <w:t>Codex edits the local files on your Mac; it should not upload your personal 2nd Brain data to GitHub</w:t>
       </w:r>
     </w:p>
     <w:p>
@@ -1531,7 +1574,7 @@
           </w:tcPr>
           <w:p>
             <w:r>
-              <w:t>Sync/save your changes</w:t>
+              <w:t>Review local changes</w:t>
             </w:r>
           </w:p>
         </w:tc>
@@ -1541,7 +1584,7 @@
           </w:tcPr>
           <w:p>
             <w:r>
-              <w:t>Tell Codex: "sync changes"</w:t>
+              <w:t>Tell Codex: "summarize today's changes"</w:t>
             </w:r>
           </w:p>
         </w:tc>
@@ -1713,7 +1756,7 @@
           <w:color w:val="2E74B5"/>
           <w:sz w:val="30"/>
         </w:rPr>
-        <w:t>Git clone fails with SSH permission errors</w:t>
+        <w:t>Git clone asks for a GitHub username or password</w:t>
       </w:r>
     </w:p>
     <w:p>
@@ -1721,7 +1764,7 @@
         <w:spacing w:after="120"/>
       </w:pPr>
       <w:r>
-        <w:t>Your GitHub SSH key may not be set up on this Mac yet. Ask Codex to help set up GitHub SSH access, or clone with HTTPS if you only need to read the files.</w:t>
+        <w:t>Make sure you used the HTTPS clone command from this guide. If it still asks for a login, the starter repository may be private. The maintainer should make it public or provide a ZIP copy.</w:t>
       </w:r>
     </w:p>
     <w:p>
@@ -1734,7 +1777,7 @@
           <w:color w:val="2E74B5"/>
           <w:sz w:val="30"/>
         </w:rPr>
-        <w:t>You forgot to sync before closing</w:t>
+        <w:t>You want the newest starter instructions later</w:t>
       </w:r>
     </w:p>
     <w:p>
@@ -1742,7 +1785,7 @@
         <w:spacing w:after="120"/>
       </w:pPr>
       <w:r>
-        <w:t>Open Terminal, go to the folder, and run:</w:t>
+        <w:t>Only do this if you specifically want updates from the starter repository. Open Terminal, go to the folder, and run:</w:t>
       </w:r>
     </w:p>
     <w:p>
@@ -1772,7 +1815,26 @@
           <w:color w:val="D40000"/>
           <w:sz w:val="20"/>
         </w:rPr>
-        <w:t>git add -A &amp;&amp; git commit -m "manual sync" &amp;&amp; git push</w:t>
+        <w:t>git pull</w:t>
+      </w:r>
+    </w:p>
+    <w:p>
+      <w:pPr>
+        <w:spacing w:after="120"/>
+      </w:pPr>
+      <w:r>
+        <w:rPr>
+          <w:b/>
+          <w:color w:val="C05000"/>
+        </w:rPr>
+        <w:t xml:space="preserve">NOTE: </w:t>
+      </w:r>
+      <w:r>
+        <w:rPr>
+          <w:i/>
+          <w:color w:val="C05000"/>
+        </w:rPr>
+        <w:t>If Git reports conflicts, stop and ask Codex to help. Do not overwrite personal 2nd Brain files.</w:t>
       </w:r>
     </w:p>
     <w:sectPr>

</xml_diff>